<commit_message>
Brand Voice Guidelines: drop the version/owner-approver card (issue #33)
Nerea's request (34b0be0d): "remove the version history and the owner
approver" — the back-cover card is confusing on a guideline that has no
board approval workflow (same rationale as the earlier Articles of
Association fix, issue #12).

The mechanism already existed (registry's no_version_card flag, wired up
in publish.py since f4b0b09) but was never actually turned on for this
document — just added "no_version_card": true to its registry entry.
Verified the back cover now renders clean (no card) and the rest of the
content is untouched. Self-review: pass (only "attention" on
approval_date, which was already missing before this change — an
unrelated pre-existing gap, not something this fix introduced).

Co-Authored-By: Claude Sonnet 5 <noreply@anthropic.com>
Claude-Session: https://claude.ai/code/session_01W3gw8scX9B7oMC33JPxjbS
</commit_message>
<xml_diff>
--- a/docs/files/BioMar_Brand_Voice_Guidelines__Policy_2026-07.docx
+++ b/docs/files/BioMar_Brand_Voice_Guidelines__Policy_2026-07.docx
@@ -19,7 +19,7 @@
               <a:graphicData uri="http://schemas.openxmlformats.org/drawingml/2006/picture">
                 <pic:pic>
                   <pic:nvPicPr>
-                    <pic:cNvPr id="0" name="tmponeallow.png"/>
+                    <pic:cNvPr id="0" name="tmpmhdvbz_x.png"/>
                     <pic:cNvPicPr/>
                   </pic:nvPicPr>
                   <pic:blipFill>
@@ -3750,135 +3750,6 @@
         <w:t>A knowledgeable, trustworthy and close partner in global aquaculture.</w:t>
       </w:r>
     </w:p>
-    <w:p/>
-    <w:tbl>
-      <w:tblPr>
-        <w:tblStyle w:val="TableGrid"/>
-        <w:tblW w:type="auto" w:w="0"/>
-        <w:jc w:val="center"/>
-        <w:tblLook w:firstColumn="1" w:firstRow="1" w:lastColumn="0" w:lastRow="0" w:noHBand="0" w:noVBand="1" w:val="04A0"/>
-      </w:tblPr>
-      <w:tblGrid>
-        <w:gridCol w:w="5103"/>
-        <w:gridCol w:w="5103"/>
-      </w:tblGrid>
-      <w:tr>
-        <w:tc>
-          <w:tcPr>
-            <w:tcW w:type="dxa" w:w="5103"/>
-            <w:shd w:val="clear" w:fill="1C4076"/>
-          </w:tcPr>
-          <w:p>
-            <w:r>
-              <w:rPr>
-                <w:rFonts w:ascii="Avenir Next LT Pro" w:hAnsi="Avenir Next LT Pro"/>
-                <w:b/>
-                <w:i w:val="0"/>
-                <w:color w:val="FFFFFF"/>
-                <w:sz w:val="20"/>
-              </w:rPr>
-              <w:t>Version history</w:t>
-            </w:r>
-          </w:p>
-        </w:tc>
-        <w:tc>
-          <w:tcPr>
-            <w:tcW w:type="dxa" w:w="5103"/>
-            <w:shd w:val="clear" w:fill="1C4076"/>
-          </w:tcPr>
-          <w:p>
-            <w:r>
-              <w:rPr>
-                <w:rFonts w:ascii="Avenir Next LT Pro" w:hAnsi="Avenir Next LT Pro"/>
-                <w:b/>
-                <w:i w:val="0"/>
-                <w:color w:val="FFFFFF"/>
-                <w:sz w:val="20"/>
-              </w:rPr>
-              <w:t>Owner and approver</w:t>
-            </w:r>
-          </w:p>
-        </w:tc>
-      </w:tr>
-      <w:tr>
-        <w:tc>
-          <w:tcPr>
-            <w:tcW w:type="dxa" w:w="5103"/>
-          </w:tcPr>
-          <w:p>
-            <w:r>
-              <w:rPr>
-                <w:rFonts w:ascii="Avenir Next LT Pro" w:hAnsi="Avenir Next LT Pro"/>
-                <w:b/>
-                <w:i w:val="0"/>
-                <w:color w:val="1C4076"/>
-                <w:sz w:val="18"/>
-              </w:rPr>
-              <w:t xml:space="preserve">Version 1: </w:t>
-            </w:r>
-            <w:r>
-              <w:rPr>
-                <w:rFonts w:ascii="Avenir Next LT Pro" w:hAnsi="Avenir Next LT Pro"/>
-                <w:b w:val="0"/>
-                <w:i w:val="0"/>
-                <w:color w:val="1C4076"/>
-                <w:sz w:val="18"/>
-              </w:rPr>
-              <w:t>July 2026</w:t>
-            </w:r>
-          </w:p>
-        </w:tc>
-        <w:tc>
-          <w:tcPr>
-            <w:tcW w:type="dxa" w:w="5103"/>
-          </w:tcPr>
-          <w:p>
-            <w:r>
-              <w:rPr>
-                <w:rFonts w:ascii="Avenir Next LT Pro" w:hAnsi="Avenir Next LT Pro"/>
-                <w:b/>
-                <w:i w:val="0"/>
-                <w:color w:val="1C4076"/>
-                <w:sz w:val="18"/>
-              </w:rPr>
-              <w:t xml:space="preserve">Owner: </w:t>
-            </w:r>
-            <w:r>
-              <w:rPr>
-                <w:rFonts w:ascii="Avenir Next LT Pro" w:hAnsi="Avenir Next LT Pro"/>
-                <w:b w:val="0"/>
-                <w:i w:val="0"/>
-                <w:color w:val="1C4076"/>
-                <w:sz w:val="18"/>
-              </w:rPr>
-              <w:t>Global Marketing</w:t>
-            </w:r>
-          </w:p>
-          <w:p>
-            <w:r>
-              <w:rPr>
-                <w:rFonts w:ascii="Avenir Next LT Pro" w:hAnsi="Avenir Next LT Pro"/>
-                <w:b/>
-                <w:i w:val="0"/>
-                <w:color w:val="1C4076"/>
-                <w:sz w:val="18"/>
-              </w:rPr>
-              <w:t xml:space="preserve">Approver: </w:t>
-            </w:r>
-            <w:r>
-              <w:rPr>
-                <w:rFonts w:ascii="Avenir Next LT Pro" w:hAnsi="Avenir Next LT Pro"/>
-                <w:b w:val="0"/>
-                <w:i w:val="0"/>
-                <w:color w:val="1C4076"/>
-                <w:sz w:val="18"/>
-              </w:rPr>
-              <w:t>Executive Committee</w:t>
-            </w:r>
-          </w:p>
-        </w:tc>
-      </w:tr>
-    </w:tbl>
     <w:sectPr>
       <w:headerReference w:type="default" r:id="rId10"/>
       <w:footerReference w:type="default" r:id="rId11"/>

</xml_diff>